<commit_message>
Web Service y Reporte
</commit_message>
<xml_diff>
--- a/P6/Reporte_Practica6.docx
+++ b/P6/Reporte_Practica6.docx
@@ -672,7 +672,21 @@
         <w:rPr>
           <w:rFonts w:ascii="Arial" w:hAnsi="Arial" w:cs="Arial"/>
         </w:rPr>
-        <w:t>. La arquitectura REST (Representational State Transfer) permite que los sistemas interactúen mediante "recursos" identificables, facilitando la interoperabilidad entre diferentes plataformas y lenguajes.</w:t>
+        <w:t>. La arquitectura REST (</w:t>
+      </w:r>
+      <w:proofErr w:type="spellStart"/>
+      <w:r>
+        <w:rPr>
+          <w:rFonts w:ascii="Arial" w:hAnsi="Arial" w:cs="Arial"/>
+        </w:rPr>
+        <w:t>Representational</w:t>
+      </w:r>
+      <w:proofErr w:type="spellEnd"/>
+      <w:r>
+        <w:rPr>
+          <w:rFonts w:ascii="Arial" w:hAnsi="Arial" w:cs="Arial"/>
+        </w:rPr>
+        <w:t xml:space="preserve"> State Transfer) permite que los sistemas interactúen mediante "recursos" identificables, facilitando la interoperabilidad entre diferentes plataformas y lenguajes.</w:t>
       </w:r>
     </w:p>
     <w:p>
@@ -690,8 +704,18 @@
           <w:b/>
           <w:bCs/>
         </w:rPr>
-        <w:t>Comunicación Asíncrona y Polling</w:t>
-      </w:r>
+        <w:t xml:space="preserve">Comunicación Asíncrona y </w:t>
+      </w:r>
+      <w:proofErr w:type="spellStart"/>
+      <w:r>
+        <w:rPr>
+          <w:rFonts w:ascii="Arial" w:hAnsi="Arial" w:cs="Arial"/>
+          <w:b/>
+          <w:bCs/>
+        </w:rPr>
+        <w:t>Polling</w:t>
+      </w:r>
+      <w:proofErr w:type="spellEnd"/>
     </w:p>
     <w:p>
       <w:pPr>
@@ -706,6 +730,7 @@
         </w:rPr>
         <w:t>En aplicaciones de alto rendimiento, es ineficiente mantener una conexión abierta mientras el servidor realiza una tarea larga. El modelo de comunicación asíncrona permite que el cliente envíe una petición y reciba una respuesta inmediata (un ID de seguimiento). Posteriormente, el cliente puede realizar consultas periódicas (</w:t>
       </w:r>
+      <w:proofErr w:type="spellStart"/>
       <w:r>
         <w:rPr>
           <w:rFonts w:ascii="Arial" w:hAnsi="Arial" w:cs="Arial"/>
@@ -714,6 +739,7 @@
         </w:rPr>
         <w:t>Polling</w:t>
       </w:r>
+      <w:proofErr w:type="spellEnd"/>
       <w:r>
         <w:rPr>
           <w:rFonts w:ascii="Arial" w:hAnsi="Arial" w:cs="Arial"/>
@@ -995,7 +1021,21 @@
         <w:rPr>
           <w:rFonts w:ascii="Arial" w:hAnsi="Arial" w:cs="Arial"/>
         </w:rPr>
-        <w:t xml:space="preserve"> utilizando el framework Flask que expone </w:t>
+        <w:t xml:space="preserve"> utilizando el </w:t>
+      </w:r>
+      <w:proofErr w:type="spellStart"/>
+      <w:r>
+        <w:rPr>
+          <w:rFonts w:ascii="Arial" w:hAnsi="Arial" w:cs="Arial"/>
+        </w:rPr>
+        <w:t>framework</w:t>
+      </w:r>
+      <w:proofErr w:type="spellEnd"/>
+      <w:r>
+        <w:rPr>
+          <w:rFonts w:ascii="Arial" w:hAnsi="Arial" w:cs="Arial"/>
+        </w:rPr>
+        <w:t xml:space="preserve"> Flask que expone </w:t>
       </w:r>
       <w:r>
         <w:rPr>
@@ -1041,7 +1081,21 @@
         <w:rPr>
           <w:rFonts w:ascii="Arial" w:hAnsi="Arial" w:cs="Arial"/>
         </w:rPr>
-        <w:t xml:space="preserve">El endpoint </w:t>
+        <w:t xml:space="preserve">El </w:t>
+      </w:r>
+      <w:proofErr w:type="spellStart"/>
+      <w:r>
+        <w:rPr>
+          <w:rFonts w:ascii="Arial" w:hAnsi="Arial" w:cs="Arial"/>
+        </w:rPr>
+        <w:t>endpoint</w:t>
+      </w:r>
+      <w:proofErr w:type="spellEnd"/>
+      <w:r>
+        <w:rPr>
+          <w:rFonts w:ascii="Arial" w:hAnsi="Arial" w:cs="Arial"/>
+        </w:rPr>
+        <w:t xml:space="preserve"> </w:t>
       </w:r>
       <w:r>
         <w:rPr>
@@ -1103,7 +1157,21 @@
         <w:rPr>
           <w:rFonts w:ascii="Arial" w:hAnsi="Arial" w:cs="Arial"/>
         </w:rPr>
-        <w:t xml:space="preserve">El endpoint </w:t>
+        <w:t xml:space="preserve">El </w:t>
+      </w:r>
+      <w:proofErr w:type="spellStart"/>
+      <w:r>
+        <w:rPr>
+          <w:rFonts w:ascii="Arial" w:hAnsi="Arial" w:cs="Arial"/>
+        </w:rPr>
+        <w:t>endpoint</w:t>
+      </w:r>
+      <w:proofErr w:type="spellEnd"/>
+      <w:r>
+        <w:rPr>
+          <w:rFonts w:ascii="Arial" w:hAnsi="Arial" w:cs="Arial"/>
+        </w:rPr>
+        <w:t xml:space="preserve"> </w:t>
       </w:r>
       <w:r>
         <w:rPr>
@@ -1112,7 +1180,27 @@
           <w:iCs/>
           <w:highlight w:val="darkGray"/>
         </w:rPr>
-        <w:t>/estatus/&lt;id_pedido&gt;</w:t>
+        <w:t>/estatus/&lt;</w:t>
+      </w:r>
+      <w:proofErr w:type="spellStart"/>
+      <w:r>
+        <w:rPr>
+          <w:rFonts w:ascii="Arial" w:hAnsi="Arial" w:cs="Arial"/>
+          <w:i/>
+          <w:iCs/>
+          <w:highlight w:val="darkGray"/>
+        </w:rPr>
+        <w:t>id_pedido</w:t>
+      </w:r>
+      <w:proofErr w:type="spellEnd"/>
+      <w:r>
+        <w:rPr>
+          <w:rFonts w:ascii="Arial" w:hAnsi="Arial" w:cs="Arial"/>
+          <w:i/>
+          <w:iCs/>
+          <w:highlight w:val="darkGray"/>
+        </w:rPr>
+        <w:t>&gt;</w:t>
       </w:r>
       <w:r>
         <w:rPr>
@@ -1226,7 +1314,21 @@
         <w:rPr>
           <w:rFonts w:ascii="Arial" w:hAnsi="Arial" w:cs="Arial"/>
         </w:rPr>
-        <w:t>Los códigos desarrollados se encuentran en el siguiente repositorio de Github:</w:t>
+        <w:t xml:space="preserve">Los códigos desarrollados se encuentran en el siguiente repositorio de </w:t>
+      </w:r>
+      <w:proofErr w:type="spellStart"/>
+      <w:r>
+        <w:rPr>
+          <w:rFonts w:ascii="Arial" w:hAnsi="Arial" w:cs="Arial"/>
+        </w:rPr>
+        <w:t>Github</w:t>
+      </w:r>
+      <w:proofErr w:type="spellEnd"/>
+      <w:r>
+        <w:rPr>
+          <w:rFonts w:ascii="Arial" w:hAnsi="Arial" w:cs="Arial"/>
+        </w:rPr>
+        <w:t>:</w:t>
       </w:r>
     </w:p>
     <w:p>
@@ -1236,6 +1338,21 @@
           <w:rFonts w:ascii="Arial" w:hAnsi="Arial" w:cs="Arial"/>
         </w:rPr>
       </w:pPr>
+      <w:hyperlink r:id="rId11" w:history="1">
+        <w:r>
+          <w:rPr>
+            <w:rStyle w:val="Hipervnculo"/>
+            <w:rFonts w:ascii="Arial" w:hAnsi="Arial" w:cs="Arial"/>
+          </w:rPr>
+          <w:t>https://github.com/CruzCris/Sistemas_Distribuidos_7CM1</w:t>
+        </w:r>
+      </w:hyperlink>
+      <w:r>
+        <w:rPr>
+          <w:rFonts w:ascii="Arial" w:hAnsi="Arial" w:cs="Arial"/>
+        </w:rPr>
+        <w:t xml:space="preserve"> </w:t>
+      </w:r>
     </w:p>
     <w:p>
       <w:pPr>
@@ -1442,7 +1559,21 @@
         <w:rPr>
           <w:rFonts w:ascii="Arial" w:hAnsi="Arial" w:cs="Arial"/>
         </w:rPr>
-        <w:t>Se comprobó que el estatus también podía ser consultado desde un navegador web ingresando la URL del endpoint GET, demostrando la naturaleza pública y estandarizada del servicio.</w:t>
+        <w:t xml:space="preserve">Se comprobó que el estatus también podía ser consultado desde un navegador web ingresando la URL del </w:t>
+      </w:r>
+      <w:proofErr w:type="spellStart"/>
+      <w:r>
+        <w:rPr>
+          <w:rFonts w:ascii="Arial" w:hAnsi="Arial" w:cs="Arial"/>
+        </w:rPr>
+        <w:t>endpoint</w:t>
+      </w:r>
+      <w:proofErr w:type="spellEnd"/>
+      <w:r>
+        <w:rPr>
+          <w:rFonts w:ascii="Arial" w:hAnsi="Arial" w:cs="Arial"/>
+        </w:rPr>
+        <w:t xml:space="preserve"> GET, demostrando la naturaleza pública y estandarizada del servicio.</w:t>
       </w:r>
     </w:p>
     <w:p>
@@ -1476,7 +1607,7 @@
                     <pic:cNvPicPr/>
                   </pic:nvPicPr>
                   <pic:blipFill>
-                    <a:blip r:embed="rId11"/>
+                    <a:blip r:embed="rId12"/>
                     <a:stretch>
                       <a:fillRect/>
                     </a:stretch>
@@ -1566,7 +1697,7 @@
                     <pic:cNvPicPr/>
                   </pic:nvPicPr>
                   <pic:blipFill>
-                    <a:blip r:embed="rId12"/>
+                    <a:blip r:embed="rId13"/>
                     <a:stretch>
                       <a:fillRect/>
                     </a:stretch>
@@ -1640,7 +1771,7 @@
                     <pic:cNvPicPr/>
                   </pic:nvPicPr>
                   <pic:blipFill>
-                    <a:blip r:embed="rId13"/>
+                    <a:blip r:embed="rId14"/>
                     <a:stretch>
                       <a:fillRect/>
                     </a:stretch>
@@ -1724,7 +1855,7 @@
                     <pic:cNvPicPr/>
                   </pic:nvPicPr>
                   <pic:blipFill>
-                    <a:blip r:embed="rId14"/>
+                    <a:blip r:embed="rId15"/>
                     <a:stretch>
                       <a:fillRect/>
                     </a:stretch>
@@ -1812,7 +1943,7 @@
                     <pic:cNvPicPr/>
                   </pic:nvPicPr>
                   <pic:blipFill>
-                    <a:blip r:embed="rId15"/>
+                    <a:blip r:embed="rId16"/>
                     <a:stretch>
                       <a:fillRect/>
                     </a:stretch>
@@ -1906,7 +2037,7 @@
                     <pic:cNvPicPr/>
                   </pic:nvPicPr>
                   <pic:blipFill>
-                    <a:blip r:embed="rId16"/>
+                    <a:blip r:embed="rId17"/>
                     <a:stretch>
                       <a:fillRect/>
                     </a:stretch>
@@ -1972,7 +2103,7 @@
                     <pic:cNvPicPr/>
                   </pic:nvPicPr>
                   <pic:blipFill>
-                    <a:blip r:embed="rId17"/>
+                    <a:blip r:embed="rId18"/>
                     <a:stretch>
                       <a:fillRect/>
                     </a:stretch>
@@ -2051,7 +2182,7 @@
                     <pic:cNvPicPr/>
                   </pic:nvPicPr>
                   <pic:blipFill>
-                    <a:blip r:embed="rId18"/>
+                    <a:blip r:embed="rId19"/>
                     <a:stretch>
                       <a:fillRect/>
                     </a:stretch>
@@ -2129,7 +2260,7 @@
                     <pic:cNvPicPr/>
                   </pic:nvPicPr>
                   <pic:blipFill>
-                    <a:blip r:embed="rId19"/>
+                    <a:blip r:embed="rId20"/>
                     <a:stretch>
                       <a:fillRect/>
                     </a:stretch>
@@ -2218,7 +2349,7 @@
                     <pic:cNvPicPr/>
                   </pic:nvPicPr>
                   <pic:blipFill>
-                    <a:blip r:embed="rId20"/>
+                    <a:blip r:embed="rId21"/>
                     <a:stretch>
                       <a:fillRect/>
                     </a:stretch>
@@ -2296,7 +2427,7 @@
                     <pic:cNvPicPr/>
                   </pic:nvPicPr>
                   <pic:blipFill>
-                    <a:blip r:embed="rId21"/>
+                    <a:blip r:embed="rId22"/>
                     <a:stretch>
                       <a:fillRect/>
                     </a:stretch>
@@ -2374,7 +2505,7 @@
                     <pic:cNvPicPr/>
                   </pic:nvPicPr>
                   <pic:blipFill>
-                    <a:blip r:embed="rId22"/>
+                    <a:blip r:embed="rId23"/>
                     <a:stretch>
                       <a:fillRect/>
                     </a:stretch>

</xml_diff>